<commit_message>
docs: finalizacao da visaoComportamental
</commit_message>
<xml_diff>
--- a/ApêndiceC-Análise/4 -VisãoComportamental/PID-Adoção.docx
+++ b/ApêndiceC-Análise/4 -VisãoComportamental/PID-Adoção.docx
@@ -1313,6 +1313,8 @@
         <w:spacing w:after="180" w:line="288" w:lineRule="auto"/>
         <w:rPr>
           <w:rFonts w:ascii="Times New Roman" w:hAnsi="Times New Roman" w:cs="Times New Roman"/>
+          <w:sz w:val="20"/>
+          <w:szCs w:val="20"/>
         </w:rPr>
       </w:pPr>
       <w:r>
@@ -1320,6 +1322,8 @@
           <w:rFonts w:ascii="Times New Roman" w:hAnsi="Times New Roman" w:cs="Times New Roman"/>
           <w:b/>
           <w:bCs/>
+          <w:sz w:val="20"/>
+          <w:szCs w:val="20"/>
         </w:rPr>
         <w:t>Fluxo de exceção</w:t>
       </w:r>
@@ -1334,6 +1338,8 @@
         <w:spacing w:after="180" w:line="288" w:lineRule="auto"/>
         <w:rPr>
           <w:rFonts w:ascii="Times New Roman" w:hAnsi="Times New Roman" w:cs="Times New Roman"/>
+          <w:sz w:val="20"/>
+          <w:szCs w:val="20"/>
         </w:rPr>
       </w:pPr>
       <w:r>
@@ -1341,6 +1347,8 @@
           <w:rFonts w:ascii="Times New Roman" w:hAnsi="Times New Roman" w:cs="Times New Roman"/>
           <w:b/>
           <w:bCs/>
+          <w:sz w:val="20"/>
+          <w:szCs w:val="20"/>
         </w:rPr>
         <w:t>E1 – Falha na validação de dados obrigatórios</w:t>
       </w:r>
@@ -1355,11 +1363,15 @@
         <w:spacing w:after="180" w:line="288" w:lineRule="auto"/>
         <w:rPr>
           <w:rFonts w:ascii="Times New Roman" w:hAnsi="Times New Roman" w:cs="Times New Roman"/>
+          <w:sz w:val="20"/>
+          <w:szCs w:val="20"/>
         </w:rPr>
       </w:pPr>
       <w:r>
         <w:rPr>
           <w:rFonts w:ascii="Times New Roman" w:hAnsi="Times New Roman" w:cs="Times New Roman"/>
+          <w:sz w:val="20"/>
+          <w:szCs w:val="20"/>
         </w:rPr>
         <w:t>Se dados fundamentais (descrição ou contato) estiverem ausentes: → Exibe mensagem apontando o campo obrigatório não preenchido. → Mantém o status do anúncio como rascunho.</w:t>
       </w:r>
@@ -2374,6 +2386,7 @@
   <w:style w:type="character" w:default="1" w:styleId="Fontepargpadro">
     <w:name w:val="Default Paragraph Font"/>
     <w:uiPriority w:val="1"/>
+    <w:semiHidden/>
     <w:unhideWhenUsed/>
   </w:style>
   <w:style w:type="table" w:default="1" w:styleId="Tabelanormal">

</xml_diff>